<commit_message>
Deploying to gh-pages from @ Morrison-Lab/psw@75d200454a9aa841014e66463ed344232b17b3e0 🚀
</commit_message>
<xml_diff>
--- a/chapters/summary.docx
+++ b/chapters/summary.docx
@@ -15,7 +15,7 @@
         <w:pStyle w:val="Date"/>
       </w:pPr>
       <w:r>
-        <w:t xml:space="preserve">Last modified: 2026-10-16 04:25:52 (PDT)</w:t>
+        <w:t xml:space="preserve">Last modified: 2026-10-16 04:37:11 (PDT)</w:t>
       </w:r>
     </w:p>
     <w:tbl>
@@ -190,7 +190,7 @@
         <w:t xml:space="preserve">Follow its link for the reasons and the exceptions.</w:t>
       </w:r>
     </w:p>
-    <w:bookmarkStart w:id="24" w:name="terms-and-notation"/>
+    <w:bookmarkStart w:id="27" w:name="terms-and-notation"/>
     <w:p>
       <w:pPr>
         <w:pStyle w:val="Heading2"/>
@@ -201,7 +201,6 @@
     </w:p>
     <w:p>
       <w:pPr>
-        <w:pStyle w:val="Compact"/>
         <w:numPr>
           <w:ilvl w:val="0"/>
           <w:numId w:val="1001"/>
@@ -230,7 +229,6 @@
     </w:p>
     <w:p>
       <w:pPr>
-        <w:pStyle w:val="Compact"/>
         <w:numPr>
           <w:ilvl w:val="0"/>
           <w:numId w:val="1001"/>
@@ -253,7 +251,6 @@
     </w:p>
     <w:p>
       <w:pPr>
-        <w:pStyle w:val="Compact"/>
         <w:numPr>
           <w:ilvl w:val="0"/>
           <w:numId w:val="1001"/>
@@ -346,7 +343,6 @@
     </w:p>
     <w:p>
       <w:pPr>
-        <w:pStyle w:val="Compact"/>
         <w:numPr>
           <w:ilvl w:val="0"/>
           <w:numId w:val="1001"/>
@@ -369,7 +365,6 @@
     </w:p>
     <w:p>
       <w:pPr>
-        <w:pStyle w:val="Compact"/>
         <w:numPr>
           <w:ilvl w:val="0"/>
           <w:numId w:val="1001"/>
@@ -395,7 +390,6 @@
     </w:p>
     <w:p>
       <w:pPr>
-        <w:pStyle w:val="Compact"/>
         <w:numPr>
           <w:ilvl w:val="0"/>
           <w:numId w:val="1001"/>
@@ -435,7 +429,6 @@
     </w:p>
     <w:p>
       <w:pPr>
-        <w:pStyle w:val="Compact"/>
         <w:numPr>
           <w:ilvl w:val="0"/>
           <w:numId w:val="1001"/>
@@ -493,7 +486,6 @@
     </w:p>
     <w:p>
       <w:pPr>
-        <w:pStyle w:val="Compact"/>
         <w:numPr>
           <w:ilvl w:val="0"/>
           <w:numId w:val="1001"/>
@@ -513,7 +505,6 @@
     </w:p>
     <w:p>
       <w:pPr>
-        <w:pStyle w:val="Compact"/>
         <w:numPr>
           <w:ilvl w:val="0"/>
           <w:numId w:val="1001"/>
@@ -539,7 +530,6 @@
     </w:p>
     <w:p>
       <w:pPr>
-        <w:pStyle w:val="Compact"/>
         <w:numPr>
           <w:ilvl w:val="0"/>
           <w:numId w:val="1001"/>
@@ -559,7 +549,6 @@
     </w:p>
     <w:p>
       <w:pPr>
-        <w:pStyle w:val="Compact"/>
         <w:numPr>
           <w:ilvl w:val="0"/>
           <w:numId w:val="1001"/>
@@ -583,8 +572,83 @@
         <w:t xml:space="preserve">such as the limits of a sum.</w:t>
       </w:r>
     </w:p>
-    <w:bookmarkEnd w:id="24"/>
-    <w:bookmarkStart w:id="33" w:name="claims-and-evidence"/>
+    <w:p>
+      <w:pPr>
+        <w:numPr>
+          <w:ilvl w:val="0"/>
+          <w:numId w:val="1001"/>
+        </w:numPr>
+      </w:pPr>
+      <w:hyperlink r:id="rId24">
+        <w:r>
+          <w:rPr>
+            <w:rStyle w:val="Hyperlink"/>
+          </w:rPr>
+          <w:t xml:space="preserve">Put words between formulas, and start a sentence with a word</w:t>
+        </w:r>
+      </w:hyperlink>
+      <w:r>
+        <w:t xml:space="preserve">,</w:t>
+      </w:r>
+      <w:r>
+        <w:t xml:space="preserve"> </w:t>
+      </w:r>
+      <w:r>
+        <w:t xml:space="preserve">not a symbol.</w:t>
+      </w:r>
+    </w:p>
+    <w:p>
+      <w:pPr>
+        <w:numPr>
+          <w:ilvl w:val="0"/>
+          <w:numId w:val="1001"/>
+        </w:numPr>
+      </w:pPr>
+      <w:hyperlink r:id="rId25">
+        <w:r>
+          <w:rPr>
+            <w:rStyle w:val="Hyperlink"/>
+          </w:rPr>
+          <w:t xml:space="preserve">Introduce a theorem with a complete sentence</w:t>
+        </w:r>
+      </w:hyperlink>
+      <w:r>
+        <w:t xml:space="preserve">,</w:t>
+      </w:r>
+      <w:r>
+        <w:t xml:space="preserve"> </w:t>
+      </w:r>
+      <w:r>
+        <w:t xml:space="preserve">and state it so that it stands alone.</w:t>
+      </w:r>
+    </w:p>
+    <w:p>
+      <w:pPr>
+        <w:numPr>
+          <w:ilvl w:val="0"/>
+          <w:numId w:val="1001"/>
+        </w:numPr>
+      </w:pPr>
+      <w:hyperlink r:id="rId26">
+        <w:r>
+          <w:rPr>
+            <w:rStyle w:val="Hyperlink"/>
+          </w:rPr>
+          <w:t xml:space="preserve">Spell out a number used as an adjective</w:t>
+        </w:r>
+      </w:hyperlink>
+      <w:r>
+        <w:t xml:space="preserve">,</w:t>
+      </w:r>
+      <w:r>
+        <w:t xml:space="preserve"> </w:t>
+      </w:r>
+      <w:r>
+        <w:t xml:space="preserve">and write the numeral for a number used as a name.</w:t>
+      </w:r>
+    </w:p>
+    <w:bookmarkEnd w:id="27"/>
+    <w:bookmarkStart w:id="36" w:name="claims-and-evidence"/>
     <w:p>
       <w:pPr>
         <w:pStyle w:val="Heading2"/>
@@ -601,7 +665,7 @@
           <w:numId w:val="1002"/>
         </w:numPr>
       </w:pPr>
-      <w:hyperlink r:id="rId25">
+      <w:hyperlink r:id="rId28">
         <w:r>
           <w:rPr>
             <w:rStyle w:val="Hyperlink"/>
@@ -624,7 +688,7 @@
           <w:numId w:val="1002"/>
         </w:numPr>
       </w:pPr>
-      <w:hyperlink r:id="rId26">
+      <w:hyperlink r:id="rId29">
         <w:r>
           <w:rPr>
             <w:rStyle w:val="Hyperlink"/>
@@ -659,7 +723,7 @@
           <w:numId w:val="1002"/>
         </w:numPr>
       </w:pPr>
-      <w:hyperlink r:id="rId27">
+      <w:hyperlink r:id="rId30">
         <w:r>
           <w:rPr>
             <w:rStyle w:val="Hyperlink"/>
@@ -676,7 +740,7 @@
       <w:r>
         <w:t xml:space="preserve"> </w:t>
       </w:r>
-      <w:hyperlink r:id="rId28">
+      <w:hyperlink r:id="rId31">
         <w:r>
           <w:rPr>
             <w:rStyle w:val="Hyperlink"/>
@@ -696,7 +760,7 @@
           <w:numId w:val="1002"/>
         </w:numPr>
       </w:pPr>
-      <w:hyperlink r:id="rId29">
+      <w:hyperlink r:id="rId32">
         <w:r>
           <w:rPr>
             <w:rStyle w:val="Hyperlink"/>
@@ -722,7 +786,7 @@
           <w:numId w:val="1002"/>
         </w:numPr>
       </w:pPr>
-      <w:hyperlink r:id="rId30">
+      <w:hyperlink r:id="rId33">
         <w:r>
           <w:rPr>
             <w:rStyle w:val="Hyperlink"/>
@@ -745,7 +809,7 @@
           <w:numId w:val="1002"/>
         </w:numPr>
       </w:pPr>
-      <w:hyperlink r:id="rId31">
+      <w:hyperlink r:id="rId34">
         <w:r>
           <w:rPr>
             <w:rStyle w:val="Hyperlink"/>
@@ -768,7 +832,7 @@
           <w:numId w:val="1002"/>
         </w:numPr>
       </w:pPr>
-      <w:hyperlink r:id="rId32">
+      <w:hyperlink r:id="rId35">
         <w:r>
           <w:rPr>
             <w:rStyle w:val="Hyperlink"/>
@@ -786,8 +850,8 @@
         <w:t xml:space="preserve">name the topic, not its author, in headings and sentences.</w:t>
       </w:r>
     </w:p>
-    <w:bookmarkEnd w:id="33"/>
-    <w:bookmarkStart w:id="41" w:name="papers"/>
+    <w:bookmarkEnd w:id="36"/>
+    <w:bookmarkStart w:id="44" w:name="papers"/>
     <w:p>
       <w:pPr>
         <w:pStyle w:val="Heading2"/>
@@ -804,7 +868,7 @@
           <w:numId w:val="1003"/>
         </w:numPr>
       </w:pPr>
-      <w:hyperlink r:id="rId34">
+      <w:hyperlink r:id="rId37">
         <w:r>
           <w:rPr>
             <w:rStyle w:val="Hyperlink"/>
@@ -827,7 +891,7 @@
           <w:numId w:val="1003"/>
         </w:numPr>
       </w:pPr>
-      <w:hyperlink r:id="rId35">
+      <w:hyperlink r:id="rId38">
         <w:r>
           <w:rPr>
             <w:rStyle w:val="Hyperlink"/>
@@ -850,7 +914,7 @@
           <w:numId w:val="1003"/>
         </w:numPr>
       </w:pPr>
-      <w:hyperlink r:id="rId36">
+      <w:hyperlink r:id="rId39">
         <w:r>
           <w:rPr>
             <w:rStyle w:val="Hyperlink"/>
@@ -873,7 +937,7 @@
           <w:numId w:val="1003"/>
         </w:numPr>
       </w:pPr>
-      <w:hyperlink r:id="rId37">
+      <w:hyperlink r:id="rId40">
         <w:r>
           <w:rPr>
             <w:rStyle w:val="Hyperlink"/>
@@ -893,7 +957,7 @@
           <w:numId w:val="1003"/>
         </w:numPr>
       </w:pPr>
-      <w:hyperlink r:id="rId38">
+      <w:hyperlink r:id="rId41">
         <w:r>
           <w:rPr>
             <w:rStyle w:val="Hyperlink"/>
@@ -919,7 +983,7 @@
       <w:r>
         <w:t xml:space="preserve"> </w:t>
       </w:r>
-      <w:hyperlink r:id="rId39">
+      <w:hyperlink r:id="rId42">
         <w:r>
           <w:rPr>
             <w:rStyle w:val="Hyperlink"/>
@@ -939,7 +1003,7 @@
       <w:r>
         <w:t xml:space="preserve"> </w:t>
       </w:r>
-      <w:hyperlink r:id="rId40">
+      <w:hyperlink r:id="rId43">
         <w:r>
           <w:rPr>
             <w:rStyle w:val="Hyperlink"/>
@@ -954,8 +1018,8 @@
         <w:t xml:space="preserve">before you submit.</w:t>
       </w:r>
     </w:p>
-    <w:bookmarkEnd w:id="41"/>
-    <w:bookmarkStart w:id="49" w:name="words"/>
+    <w:bookmarkEnd w:id="44"/>
+    <w:bookmarkStart w:id="52" w:name="words"/>
     <w:p>
       <w:pPr>
         <w:pStyle w:val="Heading2"/>
@@ -972,7 +1036,7 @@
           <w:numId w:val="1004"/>
         </w:numPr>
       </w:pPr>
-      <w:hyperlink r:id="rId42">
+      <w:hyperlink r:id="rId45">
         <w:r>
           <w:rPr>
             <w:rStyle w:val="Hyperlink"/>
@@ -995,7 +1059,7 @@
           <w:numId w:val="1004"/>
         </w:numPr>
       </w:pPr>
-      <w:hyperlink r:id="rId43">
+      <w:hyperlink r:id="rId46">
         <w:r>
           <w:rPr>
             <w:rStyle w:val="Hyperlink"/>
@@ -1015,7 +1079,7 @@
           <w:numId w:val="1004"/>
         </w:numPr>
       </w:pPr>
-      <w:hyperlink r:id="rId44">
+      <w:hyperlink r:id="rId47">
         <w:r>
           <w:rPr>
             <w:rStyle w:val="Hyperlink"/>
@@ -1035,7 +1099,7 @@
           <w:numId w:val="1004"/>
         </w:numPr>
       </w:pPr>
-      <w:hyperlink r:id="rId45">
+      <w:hyperlink r:id="rId48">
         <w:r>
           <w:rPr>
             <w:rStyle w:val="Hyperlink"/>
@@ -1070,7 +1134,7 @@
           <w:numId w:val="1004"/>
         </w:numPr>
       </w:pPr>
-      <w:hyperlink r:id="rId46">
+      <w:hyperlink r:id="rId49">
         <w:r>
           <w:rPr>
             <w:rStyle w:val="Hyperlink"/>
@@ -1090,7 +1154,7 @@
           <w:numId w:val="1004"/>
         </w:numPr>
       </w:pPr>
-      <w:hyperlink r:id="rId47">
+      <w:hyperlink r:id="rId50">
         <w:r>
           <w:rPr>
             <w:rStyle w:val="Hyperlink"/>
@@ -1116,7 +1180,7 @@
           <w:numId w:val="1004"/>
         </w:numPr>
       </w:pPr>
-      <w:hyperlink r:id="rId48">
+      <w:hyperlink r:id="rId51">
         <w:r>
           <w:rPr>
             <w:rStyle w:val="Hyperlink"/>
@@ -1128,8 +1192,8 @@
         <w:t xml:space="preserve">.</w:t>
       </w:r>
     </w:p>
-    <w:bookmarkEnd w:id="49"/>
-    <w:bookmarkStart w:id="64" w:name="writing-for-every-reader"/>
+    <w:bookmarkEnd w:id="52"/>
+    <w:bookmarkStart w:id="67" w:name="writing-for-every-reader"/>
     <w:p>
       <w:pPr>
         <w:pStyle w:val="Heading2"/>
@@ -1146,7 +1210,7 @@
           <w:numId w:val="1005"/>
         </w:numPr>
       </w:pPr>
-      <w:hyperlink r:id="rId50">
+      <w:hyperlink r:id="rId53">
         <w:r>
           <w:rPr>
             <w:rStyle w:val="Hyperlink"/>
@@ -1166,7 +1230,7 @@
           <w:numId w:val="1005"/>
         </w:numPr>
       </w:pPr>
-      <w:hyperlink r:id="rId51">
+      <w:hyperlink r:id="rId54">
         <w:r>
           <w:rPr>
             <w:rStyle w:val="Hyperlink"/>
@@ -1186,7 +1250,7 @@
           <w:numId w:val="1005"/>
         </w:numPr>
       </w:pPr>
-      <w:hyperlink r:id="rId52">
+      <w:hyperlink r:id="rId55">
         <w:r>
           <w:rPr>
             <w:rStyle w:val="Hyperlink"/>
@@ -1233,7 +1297,7 @@
           <w:numId w:val="1005"/>
         </w:numPr>
       </w:pPr>
-      <w:hyperlink r:id="rId53">
+      <w:hyperlink r:id="rId56">
         <w:r>
           <w:rPr>
             <w:rStyle w:val="Hyperlink"/>
@@ -1253,7 +1317,7 @@
           <w:numId w:val="1005"/>
         </w:numPr>
       </w:pPr>
-      <w:hyperlink r:id="rId54">
+      <w:hyperlink r:id="rId57">
         <w:r>
           <w:rPr>
             <w:rStyle w:val="Hyperlink"/>
@@ -1273,7 +1337,7 @@
       <w:r>
         <w:t xml:space="preserve"> </w:t>
       </w:r>
-      <w:hyperlink r:id="rId55">
+      <w:hyperlink r:id="rId58">
         <w:r>
           <w:rPr>
             <w:rStyle w:val="Hyperlink"/>
@@ -1293,7 +1357,7 @@
           <w:numId w:val="1005"/>
         </w:numPr>
       </w:pPr>
-      <w:hyperlink r:id="rId56">
+      <w:hyperlink r:id="rId59">
         <w:r>
           <w:rPr>
             <w:rStyle w:val="Hyperlink"/>
@@ -1313,7 +1377,7 @@
           <w:numId w:val="1005"/>
         </w:numPr>
       </w:pPr>
-      <w:hyperlink r:id="rId57">
+      <w:hyperlink r:id="rId60">
         <w:r>
           <w:rPr>
             <w:rStyle w:val="Hyperlink"/>
@@ -1333,7 +1397,7 @@
           <w:numId w:val="1005"/>
         </w:numPr>
       </w:pPr>
-      <w:hyperlink r:id="rId58">
+      <w:hyperlink r:id="rId61">
         <w:r>
           <w:rPr>
             <w:rStyle w:val="Hyperlink"/>
@@ -1353,7 +1417,7 @@
           <w:numId w:val="1005"/>
         </w:numPr>
       </w:pPr>
-      <w:hyperlink r:id="rId59">
+      <w:hyperlink r:id="rId62">
         <w:r>
           <w:rPr>
             <w:rStyle w:val="Hyperlink"/>
@@ -1373,7 +1437,7 @@
           <w:numId w:val="1005"/>
         </w:numPr>
       </w:pPr>
-      <w:hyperlink r:id="rId60">
+      <w:hyperlink r:id="rId63">
         <w:r>
           <w:rPr>
             <w:rStyle w:val="Hyperlink"/>
@@ -1393,7 +1457,7 @@
           <w:numId w:val="1005"/>
         </w:numPr>
       </w:pPr>
-      <w:hyperlink r:id="rId61">
+      <w:hyperlink r:id="rId64">
         <w:r>
           <w:rPr>
             <w:rStyle w:val="Hyperlink"/>
@@ -1413,7 +1477,7 @@
           <w:numId w:val="1005"/>
         </w:numPr>
       </w:pPr>
-      <w:hyperlink r:id="rId62">
+      <w:hyperlink r:id="rId65">
         <w:r>
           <w:rPr>
             <w:rStyle w:val="Hyperlink"/>
@@ -1433,7 +1497,7 @@
           <w:numId w:val="1005"/>
         </w:numPr>
       </w:pPr>
-      <w:hyperlink r:id="rId63">
+      <w:hyperlink r:id="rId66">
         <w:r>
           <w:rPr>
             <w:rStyle w:val="Hyperlink"/>
@@ -1445,8 +1509,8 @@
         <w:t xml:space="preserve">.</w:t>
       </w:r>
     </w:p>
-    <w:bookmarkEnd w:id="64"/>
-    <w:bookmarkStart w:id="76" w:name="sentences"/>
+    <w:bookmarkEnd w:id="67"/>
+    <w:bookmarkStart w:id="79" w:name="sentences"/>
     <w:p>
       <w:pPr>
         <w:pStyle w:val="Heading2"/>
@@ -1463,7 +1527,7 @@
           <w:numId w:val="1006"/>
         </w:numPr>
       </w:pPr>
-      <w:hyperlink r:id="rId65">
+      <w:hyperlink r:id="rId68">
         <w:r>
           <w:rPr>
             <w:rStyle w:val="Hyperlink"/>
@@ -1507,7 +1571,7 @@
           <w:numId w:val="1006"/>
         </w:numPr>
       </w:pPr>
-      <w:hyperlink r:id="rId66">
+      <w:hyperlink r:id="rId69">
         <w:r>
           <w:rPr>
             <w:rStyle w:val="Hyperlink"/>
@@ -1575,7 +1639,7 @@
           <w:numId w:val="1006"/>
         </w:numPr>
       </w:pPr>
-      <w:hyperlink r:id="rId67">
+      <w:hyperlink r:id="rId70">
         <w:r>
           <w:rPr>
             <w:rStyle w:val="Hyperlink"/>
@@ -1643,7 +1707,7 @@
           <w:numId w:val="1006"/>
         </w:numPr>
       </w:pPr>
-      <w:hyperlink r:id="rId68">
+      <w:hyperlink r:id="rId71">
         <w:r>
           <w:rPr>
             <w:rStyle w:val="Hyperlink"/>
@@ -1663,7 +1727,7 @@
           <w:numId w:val="1006"/>
         </w:numPr>
       </w:pPr>
-      <w:hyperlink r:id="rId69">
+      <w:hyperlink r:id="rId72">
         <w:r>
           <w:rPr>
             <w:rStyle w:val="Hyperlink"/>
@@ -1683,7 +1747,7 @@
           <w:numId w:val="1006"/>
         </w:numPr>
       </w:pPr>
-      <w:hyperlink r:id="rId70">
+      <w:hyperlink r:id="rId73">
         <w:r>
           <w:rPr>
             <w:rStyle w:val="Hyperlink"/>
@@ -1703,7 +1767,7 @@
           <w:numId w:val="1006"/>
         </w:numPr>
       </w:pPr>
-      <w:hyperlink r:id="rId71">
+      <w:hyperlink r:id="rId74">
         <w:r>
           <w:rPr>
             <w:rStyle w:val="Hyperlink"/>
@@ -1729,7 +1793,7 @@
           <w:numId w:val="1006"/>
         </w:numPr>
       </w:pPr>
-      <w:hyperlink r:id="rId72">
+      <w:hyperlink r:id="rId75">
         <w:r>
           <w:rPr>
             <w:rStyle w:val="Hyperlink"/>
@@ -1749,7 +1813,7 @@
           <w:numId w:val="1006"/>
         </w:numPr>
       </w:pPr>
-      <w:hyperlink r:id="rId73">
+      <w:hyperlink r:id="rId76">
         <w:r>
           <w:rPr>
             <w:rStyle w:val="Hyperlink"/>
@@ -1769,7 +1833,7 @@
           <w:numId w:val="1006"/>
         </w:numPr>
       </w:pPr>
-      <w:hyperlink r:id="rId74">
+      <w:hyperlink r:id="rId77">
         <w:r>
           <w:rPr>
             <w:rStyle w:val="Hyperlink"/>
@@ -1789,7 +1853,7 @@
           <w:numId w:val="1006"/>
         </w:numPr>
       </w:pPr>
-      <w:hyperlink r:id="rId75">
+      <w:hyperlink r:id="rId78">
         <w:r>
           <w:rPr>
             <w:rStyle w:val="Hyperlink"/>
@@ -1801,8 +1865,8 @@
         <w:t xml:space="preserve">.</w:t>
       </w:r>
     </w:p>
-    <w:bookmarkEnd w:id="76"/>
-    <w:bookmarkStart w:id="91" w:name="teaching-materials"/>
+    <w:bookmarkEnd w:id="79"/>
+    <w:bookmarkStart w:id="94" w:name="teaching-materials"/>
     <w:p>
       <w:pPr>
         <w:pStyle w:val="Heading2"/>
@@ -1819,7 +1883,7 @@
           <w:numId w:val="1007"/>
         </w:numPr>
       </w:pPr>
-      <w:hyperlink r:id="rId77">
+      <w:hyperlink r:id="rId80">
         <w:r>
           <w:rPr>
             <w:rStyle w:val="Hyperlink"/>
@@ -1839,7 +1903,7 @@
           <w:numId w:val="1007"/>
         </w:numPr>
       </w:pPr>
-      <w:hyperlink r:id="rId78">
+      <w:hyperlink r:id="rId81">
         <w:r>
           <w:rPr>
             <w:rStyle w:val="Hyperlink"/>
@@ -1859,7 +1923,7 @@
           <w:numId w:val="1007"/>
         </w:numPr>
       </w:pPr>
-      <w:hyperlink r:id="rId79">
+      <w:hyperlink r:id="rId82">
         <w:r>
           <w:rPr>
             <w:rStyle w:val="Hyperlink"/>
@@ -1882,7 +1946,7 @@
           <w:numId w:val="1007"/>
         </w:numPr>
       </w:pPr>
-      <w:hyperlink r:id="rId80">
+      <w:hyperlink r:id="rId83">
         <w:r>
           <w:rPr>
             <w:rStyle w:val="Hyperlink"/>
@@ -1902,7 +1966,7 @@
           <w:numId w:val="1007"/>
         </w:numPr>
       </w:pPr>
-      <w:hyperlink r:id="rId81">
+      <w:hyperlink r:id="rId84">
         <w:r>
           <w:rPr>
             <w:rStyle w:val="Hyperlink"/>
@@ -1922,7 +1986,7 @@
           <w:numId w:val="1007"/>
         </w:numPr>
       </w:pPr>
-      <w:hyperlink r:id="rId82">
+      <w:hyperlink r:id="rId85">
         <w:r>
           <w:rPr>
             <w:rStyle w:val="Hyperlink"/>
@@ -1942,7 +2006,7 @@
           <w:numId w:val="1007"/>
         </w:numPr>
       </w:pPr>
-      <w:hyperlink r:id="rId83">
+      <w:hyperlink r:id="rId86">
         <w:r>
           <w:rPr>
             <w:rStyle w:val="Hyperlink"/>
@@ -1962,7 +2026,7 @@
           <w:numId w:val="1007"/>
         </w:numPr>
       </w:pPr>
-      <w:hyperlink r:id="rId84">
+      <w:hyperlink r:id="rId87">
         <w:r>
           <w:rPr>
             <w:rStyle w:val="Hyperlink"/>
@@ -1982,7 +2046,7 @@
           <w:numId w:val="1007"/>
         </w:numPr>
       </w:pPr>
-      <w:hyperlink r:id="rId85">
+      <w:hyperlink r:id="rId88">
         <w:r>
           <w:rPr>
             <w:rStyle w:val="Hyperlink"/>
@@ -2002,7 +2066,7 @@
           <w:numId w:val="1007"/>
         </w:numPr>
       </w:pPr>
-      <w:hyperlink r:id="rId86">
+      <w:hyperlink r:id="rId89">
         <w:r>
           <w:rPr>
             <w:rStyle w:val="Hyperlink"/>
@@ -2025,7 +2089,7 @@
           <w:numId w:val="1007"/>
         </w:numPr>
       </w:pPr>
-      <w:hyperlink r:id="rId87">
+      <w:hyperlink r:id="rId90">
         <w:r>
           <w:rPr>
             <w:rStyle w:val="Hyperlink"/>
@@ -2045,7 +2109,7 @@
           <w:numId w:val="1007"/>
         </w:numPr>
       </w:pPr>
-      <w:hyperlink r:id="rId88">
+      <w:hyperlink r:id="rId91">
         <w:r>
           <w:rPr>
             <w:rStyle w:val="Hyperlink"/>
@@ -2065,7 +2129,7 @@
           <w:numId w:val="1007"/>
         </w:numPr>
       </w:pPr>
-      <w:hyperlink r:id="rId89">
+      <w:hyperlink r:id="rId92">
         <w:r>
           <w:rPr>
             <w:rStyle w:val="Hyperlink"/>
@@ -2100,7 +2164,7 @@
           <w:numId w:val="1007"/>
         </w:numPr>
       </w:pPr>
-      <w:hyperlink r:id="rId90">
+      <w:hyperlink r:id="rId93">
         <w:r>
           <w:rPr>
             <w:rStyle w:val="Hyperlink"/>
@@ -2118,8 +2182,8 @@
         <w:t xml:space="preserve">but keep what those repositories credit.</w:t>
       </w:r>
     </w:p>
-    <w:bookmarkEnd w:id="91"/>
-    <w:bookmarkStart w:id="95" w:name="software-text"/>
+    <w:bookmarkEnd w:id="94"/>
+    <w:bookmarkStart w:id="98" w:name="software-text"/>
     <w:p>
       <w:pPr>
         <w:pStyle w:val="Heading2"/>
@@ -2136,7 +2200,7 @@
           <w:numId w:val="1008"/>
         </w:numPr>
       </w:pPr>
-      <w:hyperlink r:id="rId92">
+      <w:hyperlink r:id="rId95">
         <w:r>
           <w:rPr>
             <w:rStyle w:val="Hyperlink"/>
@@ -2159,7 +2223,7 @@
           <w:numId w:val="1008"/>
         </w:numPr>
       </w:pPr>
-      <w:hyperlink r:id="rId93">
+      <w:hyperlink r:id="rId96">
         <w:r>
           <w:rPr>
             <w:rStyle w:val="Hyperlink"/>
@@ -2179,7 +2243,7 @@
           <w:numId w:val="1008"/>
         </w:numPr>
       </w:pPr>
-      <w:hyperlink r:id="rId94">
+      <w:hyperlink r:id="rId97">
         <w:r>
           <w:rPr>
             <w:rStyle w:val="Hyperlink"/>
@@ -2191,8 +2255,8 @@
         <w:t xml:space="preserve">.</w:t>
       </w:r>
     </w:p>
-    <w:bookmarkEnd w:id="95"/>
-    <w:bookmarkStart w:id="99" w:name="thinking"/>
+    <w:bookmarkEnd w:id="98"/>
+    <w:bookmarkStart w:id="102" w:name="thinking"/>
     <w:p>
       <w:pPr>
         <w:pStyle w:val="Heading2"/>
@@ -2209,7 +2273,7 @@
           <w:numId w:val="1009"/>
         </w:numPr>
       </w:pPr>
-      <w:hyperlink r:id="rId96">
+      <w:hyperlink r:id="rId99">
         <w:r>
           <w:rPr>
             <w:rStyle w:val="Hyperlink"/>
@@ -2229,7 +2293,7 @@
           <w:numId w:val="1009"/>
         </w:numPr>
       </w:pPr>
-      <w:hyperlink r:id="rId97">
+      <w:hyperlink r:id="rId100">
         <w:r>
           <w:rPr>
             <w:rStyle w:val="Hyperlink"/>
@@ -2249,7 +2313,7 @@
           <w:numId w:val="1009"/>
         </w:numPr>
       </w:pPr>
-      <w:hyperlink r:id="rId98">
+      <w:hyperlink r:id="rId101">
         <w:r>
           <w:rPr>
             <w:rStyle w:val="Hyperlink"/>
@@ -2261,7 +2325,7 @@
         <w:t xml:space="preserve">.</w:t>
       </w:r>
     </w:p>
-    <w:bookmarkEnd w:id="99"/>
+    <w:bookmarkEnd w:id="102"/>
     <w:sectPr>
       <w:footnotePr>
         <w:numRestart w:val="eachSect"/>

</xml_diff>

<commit_message>
Deploying to gh-pages from @ Morrison-Lab/psw@804f8bc4c928667c0a38f07981c1038a6453afe5 🚀
</commit_message>
<xml_diff>
--- a/chapters/summary.docx
+++ b/chapters/summary.docx
@@ -15,7 +15,7 @@
         <w:pStyle w:val="Date"/>
       </w:pPr>
       <w:r>
-        <w:t xml:space="preserve">Last modified: 2026-10-19 09:41:21 (PDT)</w:t>
+        <w:t xml:space="preserve">Last modified: 2026-10-19 10:00:51 (PDT)</w:t>
       </w:r>
     </w:p>
     <w:tbl>
@@ -1231,7 +1231,7 @@
       </w:r>
     </w:p>
     <w:bookmarkEnd w:id="49"/>
-    <w:bookmarkStart w:id="57" w:name="words"/>
+    <w:bookmarkStart w:id="58" w:name="words"/>
     <w:p>
       <w:pPr>
         <w:pStyle w:val="Heading2"/>
@@ -1351,6 +1351,26 @@
           <w:rPr>
             <w:rStyle w:val="Hyperlink"/>
           </w:rPr>
+          <w:t xml:space="preserve">Give a technical word one meaning</w:t>
+        </w:r>
+      </w:hyperlink>
+      <w:r>
+        <w:t xml:space="preserve">.</w:t>
+      </w:r>
+    </w:p>
+    <w:p>
+      <w:pPr>
+        <w:pStyle w:val="Compact"/>
+        <w:numPr>
+          <w:ilvl w:val="0"/>
+          <w:numId w:val="1004"/>
+        </w:numPr>
+      </w:pPr>
+      <w:hyperlink r:id="rId55">
+        <w:r>
+          <w:rPr>
+            <w:rStyle w:val="Hyperlink"/>
+          </w:rPr>
           <w:t xml:space="preserve">Minimize unnecessary jargon</w:t>
         </w:r>
       </w:hyperlink>
@@ -1366,7 +1386,7 @@
           <w:numId w:val="1004"/>
         </w:numPr>
       </w:pPr>
-      <w:hyperlink r:id="rId55">
+      <w:hyperlink r:id="rId56">
         <w:r>
           <w:rPr>
             <w:rStyle w:val="Hyperlink"/>
@@ -1392,7 +1412,7 @@
           <w:numId w:val="1004"/>
         </w:numPr>
       </w:pPr>
-      <w:hyperlink r:id="rId56">
+      <w:hyperlink r:id="rId57">
         <w:r>
           <w:rPr>
             <w:rStyle w:val="Hyperlink"/>
@@ -1404,8 +1424,8 @@
         <w:t xml:space="preserve">.</w:t>
       </w:r>
     </w:p>
-    <w:bookmarkEnd w:id="57"/>
-    <w:bookmarkStart w:id="72" w:name="writing-for-every-reader"/>
+    <w:bookmarkEnd w:id="58"/>
+    <w:bookmarkStart w:id="73" w:name="writing-for-every-reader"/>
     <w:p>
       <w:pPr>
         <w:pStyle w:val="Heading2"/>
@@ -1422,7 +1442,7 @@
           <w:numId w:val="1005"/>
         </w:numPr>
       </w:pPr>
-      <w:hyperlink r:id="rId58">
+      <w:hyperlink r:id="rId59">
         <w:r>
           <w:rPr>
             <w:rStyle w:val="Hyperlink"/>
@@ -1442,7 +1462,7 @@
           <w:numId w:val="1005"/>
         </w:numPr>
       </w:pPr>
-      <w:hyperlink r:id="rId59">
+      <w:hyperlink r:id="rId60">
         <w:r>
           <w:rPr>
             <w:rStyle w:val="Hyperlink"/>
@@ -1462,7 +1482,7 @@
           <w:numId w:val="1005"/>
         </w:numPr>
       </w:pPr>
-      <w:hyperlink r:id="rId60">
+      <w:hyperlink r:id="rId61">
         <w:r>
           <w:rPr>
             <w:rStyle w:val="Hyperlink"/>
@@ -1509,7 +1529,7 @@
           <w:numId w:val="1005"/>
         </w:numPr>
       </w:pPr>
-      <w:hyperlink r:id="rId61">
+      <w:hyperlink r:id="rId62">
         <w:r>
           <w:rPr>
             <w:rStyle w:val="Hyperlink"/>
@@ -1529,7 +1549,7 @@
           <w:numId w:val="1005"/>
         </w:numPr>
       </w:pPr>
-      <w:hyperlink r:id="rId62">
+      <w:hyperlink r:id="rId63">
         <w:r>
           <w:rPr>
             <w:rStyle w:val="Hyperlink"/>
@@ -1549,7 +1569,7 @@
       <w:r>
         <w:t xml:space="preserve"> </w:t>
       </w:r>
-      <w:hyperlink r:id="rId63">
+      <w:hyperlink r:id="rId64">
         <w:r>
           <w:rPr>
             <w:rStyle w:val="Hyperlink"/>
@@ -1569,7 +1589,7 @@
           <w:numId w:val="1005"/>
         </w:numPr>
       </w:pPr>
-      <w:hyperlink r:id="rId64">
+      <w:hyperlink r:id="rId65">
         <w:r>
           <w:rPr>
             <w:rStyle w:val="Hyperlink"/>
@@ -1589,7 +1609,7 @@
           <w:numId w:val="1005"/>
         </w:numPr>
       </w:pPr>
-      <w:hyperlink r:id="rId65">
+      <w:hyperlink r:id="rId66">
         <w:r>
           <w:rPr>
             <w:rStyle w:val="Hyperlink"/>
@@ -1609,7 +1629,7 @@
           <w:numId w:val="1005"/>
         </w:numPr>
       </w:pPr>
-      <w:hyperlink r:id="rId66">
+      <w:hyperlink r:id="rId67">
         <w:r>
           <w:rPr>
             <w:rStyle w:val="Hyperlink"/>
@@ -1629,7 +1649,7 @@
           <w:numId w:val="1005"/>
         </w:numPr>
       </w:pPr>
-      <w:hyperlink r:id="rId67">
+      <w:hyperlink r:id="rId68">
         <w:r>
           <w:rPr>
             <w:rStyle w:val="Hyperlink"/>
@@ -1649,7 +1669,7 @@
           <w:numId w:val="1005"/>
         </w:numPr>
       </w:pPr>
-      <w:hyperlink r:id="rId68">
+      <w:hyperlink r:id="rId69">
         <w:r>
           <w:rPr>
             <w:rStyle w:val="Hyperlink"/>
@@ -1669,7 +1689,7 @@
           <w:numId w:val="1005"/>
         </w:numPr>
       </w:pPr>
-      <w:hyperlink r:id="rId69">
+      <w:hyperlink r:id="rId70">
         <w:r>
           <w:rPr>
             <w:rStyle w:val="Hyperlink"/>
@@ -1689,7 +1709,7 @@
           <w:numId w:val="1005"/>
         </w:numPr>
       </w:pPr>
-      <w:hyperlink r:id="rId70">
+      <w:hyperlink r:id="rId71">
         <w:r>
           <w:rPr>
             <w:rStyle w:val="Hyperlink"/>
@@ -1709,7 +1729,7 @@
           <w:numId w:val="1005"/>
         </w:numPr>
       </w:pPr>
-      <w:hyperlink r:id="rId71">
+      <w:hyperlink r:id="rId72">
         <w:r>
           <w:rPr>
             <w:rStyle w:val="Hyperlink"/>
@@ -1721,8 +1741,8 @@
         <w:t xml:space="preserve">.</w:t>
       </w:r>
     </w:p>
-    <w:bookmarkEnd w:id="72"/>
-    <w:bookmarkStart w:id="84" w:name="sentences"/>
+    <w:bookmarkEnd w:id="73"/>
+    <w:bookmarkStart w:id="85" w:name="sentences"/>
     <w:p>
       <w:pPr>
         <w:pStyle w:val="Heading2"/>
@@ -1739,7 +1759,7 @@
           <w:numId w:val="1006"/>
         </w:numPr>
       </w:pPr>
-      <w:hyperlink r:id="rId73">
+      <w:hyperlink r:id="rId74">
         <w:r>
           <w:rPr>
             <w:rStyle w:val="Hyperlink"/>
@@ -1783,7 +1803,7 @@
           <w:numId w:val="1006"/>
         </w:numPr>
       </w:pPr>
-      <w:hyperlink r:id="rId74">
+      <w:hyperlink r:id="rId75">
         <w:r>
           <w:rPr>
             <w:rStyle w:val="Hyperlink"/>
@@ -1851,7 +1871,7 @@
           <w:numId w:val="1006"/>
         </w:numPr>
       </w:pPr>
-      <w:hyperlink r:id="rId75">
+      <w:hyperlink r:id="rId76">
         <w:r>
           <w:rPr>
             <w:rStyle w:val="Hyperlink"/>
@@ -1919,7 +1939,7 @@
           <w:numId w:val="1006"/>
         </w:numPr>
       </w:pPr>
-      <w:hyperlink r:id="rId76">
+      <w:hyperlink r:id="rId77">
         <w:r>
           <w:rPr>
             <w:rStyle w:val="Hyperlink"/>
@@ -1939,7 +1959,7 @@
           <w:numId w:val="1006"/>
         </w:numPr>
       </w:pPr>
-      <w:hyperlink r:id="rId77">
+      <w:hyperlink r:id="rId78">
         <w:r>
           <w:rPr>
             <w:rStyle w:val="Hyperlink"/>
@@ -1959,7 +1979,7 @@
           <w:numId w:val="1006"/>
         </w:numPr>
       </w:pPr>
-      <w:hyperlink r:id="rId78">
+      <w:hyperlink r:id="rId79">
         <w:r>
           <w:rPr>
             <w:rStyle w:val="Hyperlink"/>
@@ -1979,7 +1999,7 @@
           <w:numId w:val="1006"/>
         </w:numPr>
       </w:pPr>
-      <w:hyperlink r:id="rId79">
+      <w:hyperlink r:id="rId80">
         <w:r>
           <w:rPr>
             <w:rStyle w:val="Hyperlink"/>
@@ -2005,7 +2025,7 @@
           <w:numId w:val="1006"/>
         </w:numPr>
       </w:pPr>
-      <w:hyperlink r:id="rId80">
+      <w:hyperlink r:id="rId81">
         <w:r>
           <w:rPr>
             <w:rStyle w:val="Hyperlink"/>
@@ -2025,7 +2045,7 @@
           <w:numId w:val="1006"/>
         </w:numPr>
       </w:pPr>
-      <w:hyperlink r:id="rId81">
+      <w:hyperlink r:id="rId82">
         <w:r>
           <w:rPr>
             <w:rStyle w:val="Hyperlink"/>
@@ -2045,7 +2065,7 @@
           <w:numId w:val="1006"/>
         </w:numPr>
       </w:pPr>
-      <w:hyperlink r:id="rId82">
+      <w:hyperlink r:id="rId83">
         <w:r>
           <w:rPr>
             <w:rStyle w:val="Hyperlink"/>
@@ -2065,7 +2085,7 @@
           <w:numId w:val="1006"/>
         </w:numPr>
       </w:pPr>
-      <w:hyperlink r:id="rId83">
+      <w:hyperlink r:id="rId84">
         <w:r>
           <w:rPr>
             <w:rStyle w:val="Hyperlink"/>
@@ -2077,8 +2097,8 @@
         <w:t xml:space="preserve">.</w:t>
       </w:r>
     </w:p>
-    <w:bookmarkEnd w:id="84"/>
-    <w:bookmarkStart w:id="99" w:name="teaching-materials"/>
+    <w:bookmarkEnd w:id="85"/>
+    <w:bookmarkStart w:id="100" w:name="teaching-materials"/>
     <w:p>
       <w:pPr>
         <w:pStyle w:val="Heading2"/>
@@ -2095,7 +2115,7 @@
           <w:numId w:val="1007"/>
         </w:numPr>
       </w:pPr>
-      <w:hyperlink r:id="rId85">
+      <w:hyperlink r:id="rId86">
         <w:r>
           <w:rPr>
             <w:rStyle w:val="Hyperlink"/>
@@ -2115,7 +2135,7 @@
           <w:numId w:val="1007"/>
         </w:numPr>
       </w:pPr>
-      <w:hyperlink r:id="rId86">
+      <w:hyperlink r:id="rId87">
         <w:r>
           <w:rPr>
             <w:rStyle w:val="Hyperlink"/>
@@ -2135,7 +2155,7 @@
           <w:numId w:val="1007"/>
         </w:numPr>
       </w:pPr>
-      <w:hyperlink r:id="rId87">
+      <w:hyperlink r:id="rId88">
         <w:r>
           <w:rPr>
             <w:rStyle w:val="Hyperlink"/>
@@ -2158,7 +2178,7 @@
           <w:numId w:val="1007"/>
         </w:numPr>
       </w:pPr>
-      <w:hyperlink r:id="rId88">
+      <w:hyperlink r:id="rId89">
         <w:r>
           <w:rPr>
             <w:rStyle w:val="Hyperlink"/>
@@ -2178,7 +2198,7 @@
           <w:numId w:val="1007"/>
         </w:numPr>
       </w:pPr>
-      <w:hyperlink r:id="rId89">
+      <w:hyperlink r:id="rId90">
         <w:r>
           <w:rPr>
             <w:rStyle w:val="Hyperlink"/>
@@ -2198,7 +2218,7 @@
           <w:numId w:val="1007"/>
         </w:numPr>
       </w:pPr>
-      <w:hyperlink r:id="rId90">
+      <w:hyperlink r:id="rId91">
         <w:r>
           <w:rPr>
             <w:rStyle w:val="Hyperlink"/>
@@ -2218,7 +2238,7 @@
           <w:numId w:val="1007"/>
         </w:numPr>
       </w:pPr>
-      <w:hyperlink r:id="rId91">
+      <w:hyperlink r:id="rId92">
         <w:r>
           <w:rPr>
             <w:rStyle w:val="Hyperlink"/>
@@ -2238,7 +2258,7 @@
           <w:numId w:val="1007"/>
         </w:numPr>
       </w:pPr>
-      <w:hyperlink r:id="rId92">
+      <w:hyperlink r:id="rId93">
         <w:r>
           <w:rPr>
             <w:rStyle w:val="Hyperlink"/>
@@ -2258,7 +2278,7 @@
           <w:numId w:val="1007"/>
         </w:numPr>
       </w:pPr>
-      <w:hyperlink r:id="rId93">
+      <w:hyperlink r:id="rId94">
         <w:r>
           <w:rPr>
             <w:rStyle w:val="Hyperlink"/>
@@ -2278,7 +2298,7 @@
           <w:numId w:val="1007"/>
         </w:numPr>
       </w:pPr>
-      <w:hyperlink r:id="rId94">
+      <w:hyperlink r:id="rId95">
         <w:r>
           <w:rPr>
             <w:rStyle w:val="Hyperlink"/>
@@ -2301,7 +2321,7 @@
           <w:numId w:val="1007"/>
         </w:numPr>
       </w:pPr>
-      <w:hyperlink r:id="rId95">
+      <w:hyperlink r:id="rId96">
         <w:r>
           <w:rPr>
             <w:rStyle w:val="Hyperlink"/>
@@ -2321,7 +2341,7 @@
           <w:numId w:val="1007"/>
         </w:numPr>
       </w:pPr>
-      <w:hyperlink r:id="rId96">
+      <w:hyperlink r:id="rId97">
         <w:r>
           <w:rPr>
             <w:rStyle w:val="Hyperlink"/>
@@ -2341,7 +2361,7 @@
           <w:numId w:val="1007"/>
         </w:numPr>
       </w:pPr>
-      <w:hyperlink r:id="rId97">
+      <w:hyperlink r:id="rId98">
         <w:r>
           <w:rPr>
             <w:rStyle w:val="Hyperlink"/>
@@ -2376,7 +2396,7 @@
           <w:numId w:val="1007"/>
         </w:numPr>
       </w:pPr>
-      <w:hyperlink r:id="rId98">
+      <w:hyperlink r:id="rId99">
         <w:r>
           <w:rPr>
             <w:rStyle w:val="Hyperlink"/>
@@ -2394,8 +2414,8 @@
         <w:t xml:space="preserve">and remove any existing credit to your own work, but keep what that work itself credits.</w:t>
       </w:r>
     </w:p>
-    <w:bookmarkEnd w:id="99"/>
-    <w:bookmarkStart w:id="103" w:name="software-text"/>
+    <w:bookmarkEnd w:id="100"/>
+    <w:bookmarkStart w:id="104" w:name="software-text"/>
     <w:p>
       <w:pPr>
         <w:pStyle w:val="Heading2"/>
@@ -2412,7 +2432,7 @@
           <w:numId w:val="1008"/>
         </w:numPr>
       </w:pPr>
-      <w:hyperlink r:id="rId100">
+      <w:hyperlink r:id="rId101">
         <w:r>
           <w:rPr>
             <w:rStyle w:val="Hyperlink"/>
@@ -2435,7 +2455,7 @@
           <w:numId w:val="1008"/>
         </w:numPr>
       </w:pPr>
-      <w:hyperlink r:id="rId101">
+      <w:hyperlink r:id="rId102">
         <w:r>
           <w:rPr>
             <w:rStyle w:val="Hyperlink"/>
@@ -2455,7 +2475,7 @@
           <w:numId w:val="1008"/>
         </w:numPr>
       </w:pPr>
-      <w:hyperlink r:id="rId102">
+      <w:hyperlink r:id="rId103">
         <w:r>
           <w:rPr>
             <w:rStyle w:val="Hyperlink"/>
@@ -2467,8 +2487,8 @@
         <w:t xml:space="preserve">.</w:t>
       </w:r>
     </w:p>
-    <w:bookmarkEnd w:id="103"/>
-    <w:bookmarkStart w:id="107" w:name="thinking"/>
+    <w:bookmarkEnd w:id="104"/>
+    <w:bookmarkStart w:id="108" w:name="thinking"/>
     <w:p>
       <w:pPr>
         <w:pStyle w:val="Heading2"/>
@@ -2485,7 +2505,7 @@
           <w:numId w:val="1009"/>
         </w:numPr>
       </w:pPr>
-      <w:hyperlink r:id="rId104">
+      <w:hyperlink r:id="rId105">
         <w:r>
           <w:rPr>
             <w:rStyle w:val="Hyperlink"/>
@@ -2505,7 +2525,7 @@
           <w:numId w:val="1009"/>
         </w:numPr>
       </w:pPr>
-      <w:hyperlink r:id="rId105">
+      <w:hyperlink r:id="rId106">
         <w:r>
           <w:rPr>
             <w:rStyle w:val="Hyperlink"/>
@@ -2525,7 +2545,7 @@
           <w:numId w:val="1009"/>
         </w:numPr>
       </w:pPr>
-      <w:hyperlink r:id="rId106">
+      <w:hyperlink r:id="rId107">
         <w:r>
           <w:rPr>
             <w:rStyle w:val="Hyperlink"/>
@@ -2537,7 +2557,7 @@
         <w:t xml:space="preserve">.</w:t>
       </w:r>
     </w:p>
-    <w:bookmarkEnd w:id="107"/>
+    <w:bookmarkEnd w:id="108"/>
     <w:sectPr>
       <w:footnotePr>
         <w:numRestart w:val="eachSect"/>

</xml_diff>